<commit_message>
Fix page-break spacing in the Second Review supplement
Three hardcoded page breaks were forcing a page break regardless of
how much content remained on the current page, leaving two pages
~80-95% empty with the next section's heading stranded alone at the
top of a fresh page. Removed the forced breaks and added keepNext
to all heading levels instead, so a heading and the paragraph after
it are kept together automatically only when needed - content now
flows continuously and uses each page fully. 14 pages -> 12 pages
with no content removed.

Co-Authored-By: Claude Sonnet 5 <noreply@anthropic.com>
Claude-Session: https://claude.ai/code/session_01NtKqrpTuv6riB3qBRrfQW7
</commit_message>
<xml_diff>
--- a/Second-Review-Supplement.docx
+++ b/Second-Review-Supplement.docx
@@ -51,7 +51,8 @@
     <w:p>
       <w:pPr>
         <w:pStyle w:val="Heading1"/>
-        <w:spacing w:after="200" w:before="100"/>
+        <w:keepNext/>
+        <w:spacing w:after="200" w:before="360"/>
       </w:pPr>
       <w:r>
         <w:rPr>
@@ -79,6 +80,7 @@
     <w:p>
       <w:pPr>
         <w:pStyle w:val="Heading2"/>
+        <w:keepNext/>
         <w:spacing w:after="120" w:before="280"/>
       </w:pPr>
       <w:r>
@@ -383,6 +385,7 @@
     <w:p>
       <w:pPr>
         <w:pStyle w:val="Heading2"/>
+        <w:keepNext/>
         <w:spacing w:after="120" w:before="280"/>
       </w:pPr>
       <w:r>
@@ -1173,6 +1176,7 @@
     <w:p>
       <w:pPr>
         <w:pStyle w:val="Heading2"/>
+        <w:keepNext/>
         <w:spacing w:after="120" w:before="280"/>
       </w:pPr>
       <w:r>
@@ -1257,6 +1261,7 @@
     <w:p>
       <w:pPr>
         <w:pStyle w:val="Heading2"/>
+        <w:keepNext/>
         <w:spacing w:after="120" w:before="280"/>
       </w:pPr>
       <w:r>
@@ -2033,6 +2038,7 @@
     <w:p>
       <w:pPr>
         <w:pStyle w:val="Heading2"/>
+        <w:keepNext/>
         <w:spacing w:after="120" w:before="280"/>
       </w:pPr>
       <w:r>
@@ -2621,6 +2627,7 @@
     <w:p>
       <w:pPr>
         <w:pStyle w:val="Heading2"/>
+        <w:keepNext/>
         <w:spacing w:after="120" w:before="280"/>
       </w:pPr>
       <w:r>
@@ -3021,6 +3028,7 @@
     <w:p>
       <w:pPr>
         <w:pStyle w:val="Heading2"/>
+        <w:keepNext/>
         <w:spacing w:after="120" w:before="280"/>
       </w:pPr>
       <w:r>
@@ -3098,14 +3106,10 @@
       </w:r>
     </w:p>
     <w:p>
-      <w:r>
-        <w:br w:type="page"/>
-      </w:r>
-    </w:p>
-    <w:p>
       <w:pPr>
         <w:pStyle w:val="Heading1"/>
-        <w:spacing w:after="200" w:before="100"/>
+        <w:keepNext/>
+        <w:spacing w:after="200" w:before="360"/>
       </w:pPr>
       <w:r>
         <w:rPr>
@@ -3121,6 +3125,7 @@
     <w:p>
       <w:pPr>
         <w:pStyle w:val="Heading2"/>
+        <w:keepNext/>
         <w:spacing w:after="120" w:before="280"/>
       </w:pPr>
       <w:r>
@@ -3892,6 +3897,7 @@
     </w:p>
     <w:p>
       <w:pPr>
+        <w:keepNext/>
         <w:spacing w:after="100" w:before="200"/>
       </w:pPr>
       <w:r>
@@ -4297,6 +4303,7 @@
     </w:p>
     <w:p>
       <w:pPr>
+        <w:keepNext/>
         <w:spacing w:after="100" w:before="200"/>
       </w:pPr>
       <w:r>
@@ -4362,6 +4369,7 @@
     </w:p>
     <w:p>
       <w:pPr>
+        <w:keepNext/>
         <w:spacing w:after="100" w:before="200"/>
       </w:pPr>
       <w:r>
@@ -4456,6 +4464,7 @@
     </w:p>
     <w:p>
       <w:pPr>
+        <w:keepNext/>
         <w:spacing w:after="100" w:before="200"/>
       </w:pPr>
       <w:r>
@@ -5488,6 +5497,7 @@
     <w:p>
       <w:pPr>
         <w:pStyle w:val="Heading2"/>
+        <w:keepNext/>
         <w:spacing w:after="120" w:before="280"/>
       </w:pPr>
       <w:r>
@@ -5997,14 +6007,10 @@
       </w:r>
     </w:p>
     <w:p>
-      <w:r>
-        <w:br w:type="page"/>
-      </w:r>
-    </w:p>
-    <w:p>
       <w:pPr>
         <w:pStyle w:val="Heading1"/>
-        <w:spacing w:after="200" w:before="100"/>
+        <w:keepNext/>
+        <w:spacing w:after="200" w:before="360"/>
       </w:pPr>
       <w:r>
         <w:rPr>
@@ -6032,6 +6038,7 @@
     <w:p>
       <w:pPr>
         <w:pStyle w:val="Heading2"/>
+        <w:keepNext/>
         <w:spacing w:after="120" w:before="280"/>
       </w:pPr>
       <w:r>
@@ -6122,6 +6129,7 @@
     <w:p>
       <w:pPr>
         <w:pStyle w:val="Heading2"/>
+        <w:keepNext/>
         <w:spacing w:after="120" w:before="280"/>
       </w:pPr>
       <w:r>
@@ -6286,6 +6294,7 @@
     <w:p>
       <w:pPr>
         <w:pStyle w:val="Heading2"/>
+        <w:keepNext/>
         <w:spacing w:after="120" w:before="280"/>
       </w:pPr>
       <w:r>
@@ -6326,6 +6335,7 @@
     <w:p>
       <w:pPr>
         <w:pStyle w:val="Heading2"/>
+        <w:keepNext/>
         <w:spacing w:after="120" w:before="280"/>
       </w:pPr>
       <w:r>
@@ -6366,6 +6376,7 @@
     <w:p>
       <w:pPr>
         <w:pStyle w:val="Heading2"/>
+        <w:keepNext/>
         <w:spacing w:after="120" w:before="280"/>
       </w:pPr>
       <w:r>
@@ -6495,6 +6506,7 @@
     <w:p>
       <w:pPr>
         <w:pStyle w:val="Heading2"/>
+        <w:keepNext/>
         <w:spacing w:after="120" w:before="280"/>
       </w:pPr>
       <w:r>
@@ -6523,6 +6535,7 @@
     <w:p>
       <w:pPr>
         <w:pStyle w:val="Heading2"/>
+        <w:keepNext/>
         <w:spacing w:after="120" w:before="280"/>
       </w:pPr>
       <w:r>
@@ -6675,6 +6688,7 @@
     <w:p>
       <w:pPr>
         <w:pStyle w:val="Heading2"/>
+        <w:keepNext/>
         <w:spacing w:after="120" w:before="280"/>
       </w:pPr>
       <w:r>
@@ -6839,6 +6853,7 @@
     <w:p>
       <w:pPr>
         <w:pStyle w:val="Heading2"/>
+        <w:keepNext/>
         <w:spacing w:after="120" w:before="280"/>
       </w:pPr>
       <w:r>
@@ -6865,14 +6880,10 @@
       </w:r>
     </w:p>
     <w:p>
-      <w:r>
-        <w:br w:type="page"/>
-      </w:r>
-    </w:p>
-    <w:p>
       <w:pPr>
         <w:pStyle w:val="Heading1"/>
-        <w:spacing w:after="200" w:before="100"/>
+        <w:keepNext/>
+        <w:spacing w:after="200" w:before="360"/>
       </w:pPr>
       <w:r>
         <w:rPr>
@@ -6912,6 +6923,7 @@
     <w:p>
       <w:pPr>
         <w:pStyle w:val="Heading2"/>
+        <w:keepNext/>
         <w:spacing w:after="120" w:before="280"/>
       </w:pPr>
       <w:r>
@@ -7053,6 +7065,7 @@
     <w:p>
       <w:pPr>
         <w:pStyle w:val="Heading2"/>
+        <w:keepNext/>
         <w:spacing w:after="120" w:before="280"/>
       </w:pPr>
       <w:r>
@@ -7222,6 +7235,7 @@
     <w:p>
       <w:pPr>
         <w:pStyle w:val="Heading2"/>
+        <w:keepNext/>
         <w:spacing w:after="120" w:before="280"/>
       </w:pPr>
       <w:r>

</xml_diff>